<commit_message>
Regenerate the rubric after the introduction edits
Co-Authored-By: Claude Opus 5 (1M context) <noreply@anthropic.com>
</commit_message>
<xml_diff>
--- a/docs/rubric.docx
+++ b/docs/rubric.docx
@@ -2,7 +2,7 @@
 <file path=word/document.xml><?xml version="1.0" encoding="utf-8"?>
 <w:document xmlns:w="http://schemas.openxmlformats.org/wordprocessingml/2006/main" xmlns:m="http://schemas.openxmlformats.org/officeDocument/2006/math" xmlns:r="http://schemas.openxmlformats.org/officeDocument/2006/relationships" xmlns:o="urn:schemas-microsoft-com:office:office" xmlns:v="urn:schemas-microsoft-com:vml" xmlns:w10="urn:schemas-microsoft-com:office:word" xmlns:a="http://schemas.openxmlformats.org/drawingml/2006/main" xmlns:pic="http://schemas.openxmlformats.org/drawingml/2006/picture" xmlns:wp="http://schemas.openxmlformats.org/drawingml/2006/wordprocessingDrawing">
   <w:body>
-    <w:bookmarkStart w:id="55" w:name="Xff0d1af36d128fe5e5841074e6968ba97ba9259"/>
+    <w:bookmarkStart w:id="56" w:name="Xff0d1af36d128fe5e5841074e6968ba97ba9259"/>
     <w:p>
       <w:pPr>
         <w:pStyle w:val="Heading1"/>
@@ -70,13 +70,13 @@
         </w:r>
       </w:hyperlink>
     </w:p>
-    <w:bookmarkStart w:id="12" w:name="how-to-use-this"/>
+    <w:bookmarkStart w:id="12" w:name="how-to-use-this-webpage"/>
     <w:p>
       <w:pPr>
         <w:pStyle w:val="Heading2"/>
       </w:pPr>
       <w:r>
-        <w:t xml:space="preserve">How to use this</w:t>
+        <w:t xml:space="preserve">How to use this webpage</w:t>
       </w:r>
     </w:p>
     <w:p>
@@ -146,13 +146,13 @@
       </w:r>
     </w:p>
     <w:bookmarkEnd w:id="12"/>
-    <w:bookmarkStart w:id="13" w:name="if-you-are-short-of-subdeacons"/>
+    <w:bookmarkStart w:id="13" w:name="assigning-the-roles"/>
     <w:p>
       <w:pPr>
         <w:pStyle w:val="Heading2"/>
       </w:pPr>
       <w:r>
-        <w:t xml:space="preserve">If you are short of subdeacons</w:t>
+        <w:t xml:space="preserve">Assigning The Roles</w:t>
       </w:r>
     </w:p>
     <w:p>
@@ -160,129 +160,133 @@
         <w:pStyle w:val="FirstParagraph"/>
       </w:pPr>
       <w:r>
-        <w:t xml:space="preserve">The rubrics below name subdeacons throughout, because that is</w:t>
-      </w:r>
-      <w:r>
-        <w:t xml:space="preserve"> </w:t>
-      </w:r>
-      <w:r>
-        <w:t xml:space="preserve">what a hierarchical Liturgy assumes. Most parishes will not have</w:t>
-      </w:r>
-      <w:r>
-        <w:t xml:space="preserve"> </w:t>
-      </w:r>
-      <w:r>
-        <w:t xml:space="preserve">two, and the offices are filled by appointment rather than left</w:t>
-      </w:r>
-      <w:r>
-        <w:t xml:space="preserve"> </w:t>
-      </w:r>
-      <w:r>
-        <w:t xml:space="preserve">empty.</w:t>
-      </w:r>
-    </w:p>
-    <w:p>
-      <w:pPr>
-        <w:pStyle w:val="BodyText"/>
-      </w:pPr>
-      <w:r>
-        <w:rPr>
-          <w:b/>
-          <w:bCs/>
-        </w:rPr>
-        <w:t xml:space="preserve">With no subdeacons</w:t>
-      </w:r>
-      <w:r>
-        <w:t xml:space="preserve">, appoint two senior altar servers to do</w:t>
-      </w:r>
-      <w:r>
-        <w:t xml:space="preserve"> </w:t>
-      </w:r>
-      <w:r>
-        <w:t xml:space="preserve">their work. They should be vested and know the whole sequence</w:t>
-      </w:r>
-      <w:r>
-        <w:t xml:space="preserve"> </w:t>
-      </w:r>
-      <w:r>
-        <w:t xml:space="preserve">beforehand — this is not a role to hand to someone on the day.</w:t>
-      </w:r>
-    </w:p>
-    <w:p>
-      <w:pPr>
-        <w:pStyle w:val="BodyText"/>
-      </w:pPr>
-      <w:r>
-        <w:rPr>
-          <w:b/>
-          <w:bCs/>
-        </w:rPr>
-        <w:t xml:space="preserve">A young server</w:t>
-      </w:r>
-      <w:r>
-        <w:t xml:space="preserve"> </w:t>
-      </w:r>
-      <w:r>
-        <w:t xml:space="preserve">carries the water, the basin and the towel for</w:t>
-      </w:r>
-      <w:r>
-        <w:t xml:space="preserve"> </w:t>
-      </w:r>
-      <w:r>
-        <w:t xml:space="preserve">the washing of the hands.</w:t>
-      </w:r>
-    </w:p>
-    <w:p>
-      <w:pPr>
-        <w:pStyle w:val="BodyText"/>
-      </w:pPr>
-      <w:r>
-        <w:rPr>
-          <w:b/>
-          <w:bCs/>
-        </w:rPr>
-        <w:t xml:space="preserve">One server to the north and one to the south</w:t>
-      </w:r>
-      <w:r>
-        <w:t xml:space="preserve">, each</w:t>
-      </w:r>
-      <w:r>
-        <w:t xml:space="preserve"> </w:t>
-      </w:r>
-      <w:r>
-        <w:t xml:space="preserve">responsible for the censer on their own side, and for fetching</w:t>
-      </w:r>
-      <w:r>
-        <w:t xml:space="preserve"> </w:t>
-      </w:r>
-      <w:r>
-        <w:t xml:space="preserve">and returning what is needed there.</w:t>
-      </w:r>
-    </w:p>
-    <w:p>
-      <w:pPr>
-        <w:pStyle w:val="BodyText"/>
-      </w:pPr>
-      <w:r>
-        <w:rPr>
-          <w:i/>
-          <w:iCs/>
-        </w:rPr>
-        <w:t xml:space="preserve">[Add the rest here — the roles above are only the ones we have</w:t>
-      </w:r>
-      <w:r>
-        <w:rPr>
-          <w:i/>
-          <w:iCs/>
-        </w:rPr>
-        <w:t xml:space="preserve"> </w:t>
-      </w:r>
-      <w:r>
-        <w:rPr>
-          <w:i/>
-          <w:iCs/>
-        </w:rPr>
-        <w:t xml:space="preserve">talked through, and you know the others.]</w:t>
+        <w:t xml:space="preserve">The rubrics below call on subdeacons throughout. You may have to</w:t>
+      </w:r>
+      <w:r>
+        <w:t xml:space="preserve"> </w:t>
+      </w:r>
+      <w:r>
+        <w:t xml:space="preserve">appoint one or even two subdeacons choosing adult, experienced</w:t>
+      </w:r>
+      <w:r>
+        <w:t xml:space="preserve"> </w:t>
+      </w:r>
+      <w:r>
+        <w:t xml:space="preserve">altar servers for the role. They should be vested and know the</w:t>
+      </w:r>
+      <w:r>
+        <w:t xml:space="preserve"> </w:t>
+      </w:r>
+      <w:r>
+        <w:t xml:space="preserve">whole sequence beforehand — this is not a role to hand to someone</w:t>
+      </w:r>
+      <w:r>
+        <w:t xml:space="preserve"> </w:t>
+      </w:r>
+      <w:r>
+        <w:t xml:space="preserve">on the day. Another option is to have deacons act as subdeacons.</w:t>
+      </w:r>
+    </w:p>
+    <w:p>
+      <w:pPr>
+        <w:pStyle w:val="BodyText"/>
+      </w:pPr>
+      <w:r>
+        <w:t xml:space="preserve">Another important role, is the altar server who will bring out the</w:t>
+      </w:r>
+      <w:r>
+        <w:t xml:space="preserve"> </w:t>
+      </w:r>
+      <w:r>
+        <w:t xml:space="preserve">bowl, pitcher and towel for the washing of the Bishops hands.</w:t>
+      </w:r>
+      <w:r>
+        <w:t xml:space="preserve"> </w:t>
+      </w:r>
+      <w:r>
+        <w:t xml:space="preserve">Usually this is a junior server who will be greatly encouraged by</w:t>
+      </w:r>
+      <w:r>
+        <w:t xml:space="preserve"> </w:t>
+      </w:r>
+      <w:r>
+        <w:t xml:space="preserve">playing this important role.</w:t>
+      </w:r>
+    </w:p>
+    <w:p>
+      <w:pPr>
+        <w:pStyle w:val="BodyText"/>
+      </w:pPr>
+      <w:r>
+        <w:t xml:space="preserve">Having two more adult servers who will keep an eye on things on</w:t>
+      </w:r>
+      <w:r>
+        <w:t xml:space="preserve"> </w:t>
+      </w:r>
+      <w:r>
+        <w:t xml:space="preserve">the north and south sides of the altar is a good idea. They should</w:t>
+      </w:r>
+      <w:r>
+        <w:t xml:space="preserve"> </w:t>
+      </w:r>
+      <w:r>
+        <w:t xml:space="preserve">watch the subdeacons for direction, and can be a great help in</w:t>
+      </w:r>
+      <w:r>
+        <w:t xml:space="preserve"> </w:t>
+      </w:r>
+      <w:r>
+        <w:t xml:space="preserve">keeping things running smoothly by paying attention.</w:t>
+      </w:r>
+    </w:p>
+    <w:bookmarkEnd w:id="13"/>
+    <w:bookmarkStart w:id="14" w:name="help-us-make-this-better"/>
+    <w:p>
+      <w:pPr>
+        <w:pStyle w:val="Heading2"/>
+      </w:pPr>
+      <w:r>
+        <w:t xml:space="preserve">Help us Make this better!</w:t>
+      </w:r>
+    </w:p>
+    <w:p>
+      <w:pPr>
+        <w:pStyle w:val="FirstParagraph"/>
+      </w:pPr>
+      <w:r>
+        <w:t xml:space="preserve">This site came out of the 2026 Diocese of NY and NJ Deaconal</w:t>
+      </w:r>
+      <w:r>
+        <w:t xml:space="preserve"> </w:t>
+      </w:r>
+      <w:r>
+        <w:t xml:space="preserve">Retreat. The video was recorded at the retreat, and was edited</w:t>
+      </w:r>
+      <w:r>
+        <w:t xml:space="preserve"> </w:t>
+      </w:r>
+      <w:r>
+        <w:t xml:space="preserve">and annotated by Dn. Mitch VanDuyn, of St. John the Baptist</w:t>
+      </w:r>
+      <w:r>
+        <w:t xml:space="preserve"> </w:t>
+      </w:r>
+      <w:r>
+        <w:t xml:space="preserve">Rochester NY.</w:t>
+      </w:r>
+    </w:p>
+    <w:p>
+      <w:pPr>
+        <w:pStyle w:val="BodyText"/>
+      </w:pPr>
+      <w:r>
+        <w:t xml:space="preserve">Please forgive me for any errors, or omissions, and your corrections</w:t>
+      </w:r>
+      <w:r>
+        <w:t xml:space="preserve"> </w:t>
+      </w:r>
+      <w:r>
+        <w:t xml:space="preserve">and input are most welcome.</w:t>
       </w:r>
     </w:p>
     <w:p>
@@ -293,7 +297,7 @@
         <w:rPr>
           <w:rStyle w:val="VerbatimChar"/>
         </w:rPr>
-        <w:t xml:space="preserve">generated 25 Aug 2026, 02:16 · 9816244</w:t>
+        <w:t xml:space="preserve">generated 25 Aug 2026, 02:33 · 45fd66c</w:t>
       </w:r>
     </w:p>
     <w:p>
@@ -311,8 +315,8 @@
         </w:pict>
       </w:r>
     </w:p>
-    <w:bookmarkEnd w:id="13"/>
-    <w:bookmarkStart w:id="14" w:name="contents"/>
+    <w:bookmarkEnd w:id="14"/>
+    <w:bookmarkStart w:id="15" w:name="contents"/>
     <w:p>
       <w:pPr>
         <w:pStyle w:val="Heading2"/>
@@ -768,8 +772,8 @@
         <w:t xml:space="preserve">Page references are from St. Tikhon’s Hieratikon Vol 2, 2017</w:t>
       </w:r>
     </w:p>
-    <w:bookmarkEnd w:id="14"/>
-    <w:bookmarkStart w:id="18" w:name="greeting-of-the-hierarch-at-the-doors"/>
+    <w:bookmarkEnd w:id="15"/>
+    <w:bookmarkStart w:id="19" w:name="greeting-of-the-hierarch-at-the-doors"/>
     <w:p>
       <w:pPr>
         <w:pStyle w:val="Heading2"/>
@@ -827,18 +831,18 @@
           <wp:inline>
             <wp:extent cx="5334000" cy="3000375"/>
             <wp:effectExtent b="0" l="0" r="0" t="0"/>
-            <wp:docPr descr="Greeting of the Hierarch at the Doors — plan" title="" id="16" name="Picture"/>
+            <wp:docPr descr="Greeting of the Hierarch at the Doors — plan" title="" id="17" name="Picture"/>
             <a:graphic>
               <a:graphicData uri="http://schemas.openxmlformats.org/drawingml/2006/picture">
                 <pic:pic>
                   <pic:nvPicPr>
-                    <pic:cNvPr descr="../art/greeting_plan.png" id="17" name="Picture"/>
+                    <pic:cNvPr descr="../art/greeting_plan.png" id="18" name="Picture"/>
                     <pic:cNvPicPr>
                       <a:picLocks noChangeArrowheads="1" noChangeAspect="1"/>
                     </pic:cNvPicPr>
                   </pic:nvPicPr>
                   <pic:blipFill>
-                    <a:blip r:embed="rId15"/>
+                    <a:blip r:embed="rId16"/>
                     <a:stretch>
                       <a:fillRect/>
                     </a:stretch>
@@ -1073,8 +1077,8 @@
         <w:t xml:space="preserve">At the conclusion, the priest presents the cross</w:t>
       </w:r>
     </w:p>
-    <w:bookmarkEnd w:id="18"/>
-    <w:bookmarkStart w:id="19" w:name="the-bishop-enters-the-nave"/>
+    <w:bookmarkEnd w:id="19"/>
+    <w:bookmarkStart w:id="20" w:name="the-bishop-enters-the-nave"/>
     <w:p>
       <w:pPr>
         <w:pStyle w:val="Heading2"/>
@@ -1411,8 +1415,8 @@
         <w:t xml:space="preserve">The two servers holding the censers return them to the altar</w:t>
       </w:r>
     </w:p>
-    <w:bookmarkEnd w:id="19"/>
-    <w:bookmarkStart w:id="20" w:name="entrance-prayers"/>
+    <w:bookmarkEnd w:id="20"/>
+    <w:bookmarkStart w:id="21" w:name="entrance-prayers"/>
     <w:p>
       <w:pPr>
         <w:pStyle w:val="Heading2"/>
@@ -1489,8 +1493,8 @@
         <w:t xml:space="preserve">“I will enter thy house”</w:t>
       </w:r>
     </w:p>
-    <w:bookmarkEnd w:id="20"/>
-    <w:bookmarkStart w:id="21" w:name="preparing-to-vest-the-bishop"/>
+    <w:bookmarkEnd w:id="21"/>
+    <w:bookmarkStart w:id="22" w:name="preparing-to-vest-the-bishop"/>
     <w:p>
       <w:pPr>
         <w:pStyle w:val="Heading2"/>
@@ -1659,8 +1663,8 @@
         <w:t xml:space="preserve">retrieve loaded censers from north and south doors</w:t>
       </w:r>
     </w:p>
-    <w:bookmarkEnd w:id="21"/>
-    <w:bookmarkStart w:id="22" w:name="vesting-the-bishop"/>
+    <w:bookmarkEnd w:id="22"/>
+    <w:bookmarkStart w:id="23" w:name="vesting-the-bishop"/>
     <w:p>
       <w:pPr>
         <w:pStyle w:val="Heading2"/>
@@ -2063,8 +2067,8 @@
         <w:t xml:space="preserve">During the vesting the deacons continuously cense the Bishop.</w:t>
       </w:r>
     </w:p>
-    <w:bookmarkEnd w:id="22"/>
-    <w:bookmarkStart w:id="23" w:name="the-blessing-of-the-dikiri-and-trikiri"/>
+    <w:bookmarkEnd w:id="23"/>
+    <w:bookmarkStart w:id="24" w:name="the-blessing-of-the-dikiri-and-trikiri"/>
     <w:p>
       <w:pPr>
         <w:pStyle w:val="Heading2"/>
@@ -2432,8 +2436,8 @@
         <w:t xml:space="preserve">bowing first to the altar, then to the Bishop</w:t>
       </w:r>
     </w:p>
-    <w:bookmarkEnd w:id="23"/>
-    <w:bookmarkStart w:id="24" w:name="final-prayers-before-the-liturgy"/>
+    <w:bookmarkEnd w:id="24"/>
+    <w:bookmarkStart w:id="25" w:name="final-prayers-before-the-liturgy"/>
     <w:p>
       <w:pPr>
         <w:pStyle w:val="Heading2"/>
@@ -2792,8 +2796,8 @@
         <w:t xml:space="preserve">note: this is done before each litany by both deacons, remember get a blessing to proceed</w:t>
       </w:r>
     </w:p>
-    <w:bookmarkEnd w:id="24"/>
-    <w:bookmarkStart w:id="25" w:name="washing-of-the-hands"/>
+    <w:bookmarkEnd w:id="25"/>
+    <w:bookmarkStart w:id="26" w:name="washing-of-the-hands"/>
     <w:p>
       <w:pPr>
         <w:pStyle w:val="Heading2"/>
@@ -2936,8 +2940,8 @@
         <w:t xml:space="preserve">moves forward to stand before the Theotokos</w:t>
       </w:r>
     </w:p>
-    <w:bookmarkEnd w:id="25"/>
-    <w:bookmarkStart w:id="26" w:name="X47a719300886e5c33c0e97daeae1e65b8508ca8"/>
+    <w:bookmarkEnd w:id="26"/>
+    <w:bookmarkStart w:id="27" w:name="X47a719300886e5c33c0e97daeae1e65b8508ca8"/>
     <w:p>
       <w:pPr>
         <w:pStyle w:val="Heading2"/>
@@ -3094,8 +3098,8 @@
         <w:t xml:space="preserve">As the first antiphon concludes, bow to the icon, and then to the Bishop</w:t>
       </w:r>
     </w:p>
-    <w:bookmarkEnd w:id="26"/>
-    <w:bookmarkStart w:id="27" w:name="the-second-antiphon"/>
+    <w:bookmarkEnd w:id="27"/>
+    <w:bookmarkStart w:id="28" w:name="the-second-antiphon"/>
     <w:p>
       <w:pPr>
         <w:pStyle w:val="Heading2"/>
@@ -3148,8 +3152,8 @@
         <w:t xml:space="preserve">The third Litany is chanted as usual.</w:t>
       </w:r>
     </w:p>
-    <w:bookmarkEnd w:id="27"/>
-    <w:bookmarkStart w:id="28" w:name="the-beginning-of-the-little-entrance"/>
+    <w:bookmarkEnd w:id="28"/>
+    <w:bookmarkStart w:id="29" w:name="the-beginning-of-the-little-entrance"/>
     <w:p>
       <w:pPr>
         <w:pStyle w:val="Heading2"/>
@@ -3616,8 +3620,8 @@
         <w:t xml:space="preserve">everyone is now facing each other with the Bishop at the center</w:t>
       </w:r>
     </w:p>
-    <w:bookmarkEnd w:id="28"/>
-    <w:bookmarkStart w:id="29" w:name="the-conclusion-of-the-little-entrance"/>
+    <w:bookmarkEnd w:id="29"/>
+    <w:bookmarkStart w:id="30" w:name="the-conclusion-of-the-little-entrance"/>
     <w:p>
       <w:pPr>
         <w:pStyle w:val="Heading2"/>
@@ -3894,8 +3898,8 @@
         <w:t xml:space="preserve">Dikiri and Trikiri</w:t>
       </w:r>
     </w:p>
-    <w:bookmarkEnd w:id="29"/>
-    <w:bookmarkStart w:id="30" w:name="X2e49296d3ebe6e04154a558d167af870e7506bb"/>
+    <w:bookmarkEnd w:id="30"/>
+    <w:bookmarkStart w:id="31" w:name="X2e49296d3ebe6e04154a558d167af870e7506bb"/>
     <w:p>
       <w:pPr>
         <w:pStyle w:val="Heading2"/>
@@ -3994,8 +3998,8 @@
         <w:t xml:space="preserve">A server takes the Dikiri, while the first deacon takes the censer.</w:t>
       </w:r>
     </w:p>
-    <w:bookmarkEnd w:id="30"/>
-    <w:bookmarkStart w:id="31" w:name="X3e90ce30e5a043d255ce9c37e6bb0da9a6e8181"/>
+    <w:bookmarkEnd w:id="31"/>
+    <w:bookmarkStart w:id="32" w:name="X3e90ce30e5a043d255ce9c37e6bb0da9a6e8181"/>
     <w:p>
       <w:pPr>
         <w:pStyle w:val="Heading2"/>
@@ -4464,8 +4468,8 @@
         <w:t xml:space="preserve">to the Bishop</w:t>
       </w:r>
     </w:p>
-    <w:bookmarkEnd w:id="31"/>
-    <w:bookmarkStart w:id="32" w:name="conclusion-of-thrice-holy"/>
+    <w:bookmarkEnd w:id="32"/>
+    <w:bookmarkStart w:id="33" w:name="conclusion-of-thrice-holy"/>
     <w:p>
       <w:pPr>
         <w:pStyle w:val="Heading2"/>
@@ -4566,8 +4570,8 @@
         <w:t xml:space="preserve">cross facing the people.</w:t>
       </w:r>
     </w:p>
-    <w:bookmarkEnd w:id="32"/>
-    <w:bookmarkStart w:id="33" w:name="lesser-censing-and-epistle-reading"/>
+    <w:bookmarkEnd w:id="33"/>
+    <w:bookmarkStart w:id="34" w:name="lesser-censing-and-epistle-reading"/>
     <w:p>
       <w:pPr>
         <w:pStyle w:val="Heading2"/>
@@ -4921,8 +4925,8 @@
         <w:t xml:space="preserve">Bishop, and gives away the censer.</w:t>
       </w:r>
     </w:p>
-    <w:bookmarkEnd w:id="33"/>
-    <w:bookmarkStart w:id="34" w:name="alleluias-and-the-gospel-book-goes-out"/>
+    <w:bookmarkEnd w:id="34"/>
+    <w:bookmarkStart w:id="35" w:name="alleluias-and-the-gospel-book-goes-out"/>
     <w:p>
       <w:pPr>
         <w:pStyle w:val="Heading2"/>
@@ -5089,8 +5093,8 @@
         <w:t xml:space="preserve">Two deacons should cross beside each other.</w:t>
       </w:r>
     </w:p>
-    <w:bookmarkEnd w:id="34"/>
-    <w:bookmarkStart w:id="35" w:name="reading-of-the-gospel"/>
+    <w:bookmarkEnd w:id="35"/>
+    <w:bookmarkStart w:id="36" w:name="reading-of-the-gospel"/>
     <w:p>
       <w:pPr>
         <w:pStyle w:val="Heading2"/>
@@ -5325,8 +5329,8 @@
         <w:t xml:space="preserve">presents Omophoron to the Bishop to kiss.</w:t>
       </w:r>
     </w:p>
-    <w:bookmarkEnd w:id="35"/>
-    <w:bookmarkStart w:id="36" w:name="gospel-is-returned-to-the-altar"/>
+    <w:bookmarkEnd w:id="36"/>
+    <w:bookmarkStart w:id="37" w:name="gospel-is-returned-to-the-altar"/>
     <w:p>
       <w:pPr>
         <w:pStyle w:val="Heading2"/>
@@ -5481,8 +5485,8 @@
         <w:t xml:space="preserve">and kisses the altar</w:t>
       </w:r>
     </w:p>
-    <w:bookmarkEnd w:id="36"/>
-    <w:bookmarkStart w:id="37" w:name="augmented-litany-begins"/>
+    <w:bookmarkEnd w:id="37"/>
+    <w:bookmarkStart w:id="38" w:name="augmented-litany-begins"/>
     <w:p>
       <w:pPr>
         <w:pStyle w:val="Heading2"/>
@@ -5517,8 +5521,8 @@
         <w:t xml:space="preserve">after the Sermon as usual</w:t>
       </w:r>
     </w:p>
-    <w:bookmarkEnd w:id="37"/>
-    <w:bookmarkStart w:id="38" w:name="X0a86f6eccd19f643567f3589c71dc197395a421"/>
+    <w:bookmarkEnd w:id="38"/>
+    <w:bookmarkStart w:id="39" w:name="X0a86f6eccd19f643567f3589c71dc197395a421"/>
     <w:p>
       <w:pPr>
         <w:pStyle w:val="Heading2"/>
@@ -6129,8 +6133,8 @@
         <w:t xml:space="preserve">and the people.</w:t>
       </w:r>
     </w:p>
-    <w:bookmarkEnd w:id="38"/>
-    <w:bookmarkStart w:id="39" w:name="clergy-kissing-the-bishops-shoulder"/>
+    <w:bookmarkEnd w:id="39"/>
+    <w:bookmarkStart w:id="40" w:name="clergy-kissing-the-bishops-shoulder"/>
     <w:p>
       <w:pPr>
         <w:pStyle w:val="Heading2"/>
@@ -6179,8 +6183,8 @@
         <w:t xml:space="preserve">shoulder.</w:t>
       </w:r>
     </w:p>
-    <w:bookmarkEnd w:id="39"/>
-    <w:bookmarkStart w:id="40" w:name="the-bishop-makes-his-commemorations"/>
+    <w:bookmarkEnd w:id="40"/>
+    <w:bookmarkStart w:id="41" w:name="the-bishop-makes-his-commemorations"/>
     <w:p>
       <w:pPr>
         <w:pStyle w:val="Heading2"/>
@@ -6251,8 +6255,8 @@
         <w:t xml:space="preserve">complete the Proskomedia with the Bishop.</w:t>
       </w:r>
     </w:p>
-    <w:bookmarkEnd w:id="40"/>
-    <w:bookmarkStart w:id="44" w:name="X522bcda74686242fb49172324eb7ed4b78a907a"/>
+    <w:bookmarkEnd w:id="41"/>
+    <w:bookmarkStart w:id="45" w:name="X522bcda74686242fb49172324eb7ed4b78a907a"/>
     <w:p>
       <w:pPr>
         <w:pStyle w:val="Heading2"/>
@@ -6290,18 +6294,18 @@
           <wp:inline>
             <wp:extent cx="5334000" cy="3000375"/>
             <wp:effectExtent b="0" l="0" r="0" t="0"/>
-            <wp:docPr descr="The Great Entrance — positions" title="" id="42" name="Picture"/>
+            <wp:docPr descr="The Great Entrance — positions" title="" id="43" name="Picture"/>
             <a:graphic>
               <a:graphicData uri="http://schemas.openxmlformats.org/drawingml/2006/picture">
                 <pic:pic>
                   <pic:nvPicPr>
-                    <pic:cNvPr descr="../art/great_entrance_plan.png" id="43" name="Picture"/>
+                    <pic:cNvPr descr="../art/great_entrance_plan.png" id="44" name="Picture"/>
                     <pic:cNvPicPr>
                       <a:picLocks noChangeArrowheads="1" noChangeAspect="1"/>
                     </pic:cNvPicPr>
                   </pic:nvPicPr>
                   <pic:blipFill>
-                    <a:blip r:embed="rId41"/>
+                    <a:blip r:embed="rId42"/>
                     <a:stretch>
                       <a:fillRect/>
                     </a:stretch>
@@ -7068,8 +7072,8 @@
         <w:t xml:space="preserve">outside the sanctuary during the Great Entrance.</w:t>
       </w:r>
     </w:p>
-    <w:bookmarkEnd w:id="44"/>
-    <w:bookmarkStart w:id="45" w:name="conclusion-of-the-great-entrance"/>
+    <w:bookmarkEnd w:id="45"/>
+    <w:bookmarkStart w:id="46" w:name="conclusion-of-the-great-entrance"/>
     <w:p>
       <w:pPr>
         <w:pStyle w:val="Heading2"/>
@@ -7208,8 +7212,8 @@
         <w:t xml:space="preserve">Altar.</w:t>
       </w:r>
     </w:p>
-    <w:bookmarkEnd w:id="45"/>
-    <w:bookmarkStart w:id="46" w:name="litany-of-supplication-and-the-creed"/>
+    <w:bookmarkEnd w:id="46"/>
+    <w:bookmarkStart w:id="47" w:name="litany-of-supplication-and-the-creed"/>
     <w:p>
       <w:pPr>
         <w:pStyle w:val="Heading2"/>
@@ -7252,8 +7256,8 @@
         <w:t xml:space="preserve">the normal rubrics.</w:t>
       </w:r>
     </w:p>
-    <w:bookmarkEnd w:id="46"/>
-    <w:bookmarkStart w:id="47" w:name="the-anaphora-part-1"/>
+    <w:bookmarkEnd w:id="47"/>
+    <w:bookmarkStart w:id="48" w:name="the-anaphora-part-1"/>
     <w:p>
       <w:pPr>
         <w:pStyle w:val="Heading2"/>
@@ -7502,8 +7506,8 @@
         <w:t xml:space="preserve">the altar and hold the star as usual.</w:t>
       </w:r>
     </w:p>
-    <w:bookmarkEnd w:id="47"/>
-    <w:bookmarkStart w:id="48" w:name="the-anaphora-part-2"/>
+    <w:bookmarkEnd w:id="48"/>
+    <w:bookmarkStart w:id="49" w:name="the-anaphora-part-2"/>
     <w:p>
       <w:pPr>
         <w:pStyle w:val="Heading2"/>
@@ -7546,8 +7550,8 @@
         <w:t xml:space="preserve">the first deacon raising the chalice.</w:t>
       </w:r>
     </w:p>
-    <w:bookmarkEnd w:id="48"/>
-    <w:bookmarkStart w:id="49" w:name="the-anaphora-part-3"/>
+    <w:bookmarkEnd w:id="49"/>
+    <w:bookmarkStart w:id="50" w:name="the-anaphora-part-3"/>
     <w:p>
       <w:pPr>
         <w:pStyle w:val="Heading2"/>
@@ -7723,8 +7727,8 @@
         <w:t xml:space="preserve">(all said by the first deacon pg 134)</w:t>
       </w:r>
     </w:p>
-    <w:bookmarkEnd w:id="49"/>
-    <w:bookmarkStart w:id="50" w:name="the-anaphora-part-4"/>
+    <w:bookmarkEnd w:id="50"/>
+    <w:bookmarkStart w:id="51" w:name="the-anaphora-part-4"/>
     <w:p>
       <w:pPr>
         <w:pStyle w:val="Heading2"/>
@@ -8737,8 +8741,8 @@
         <w:t xml:space="preserve">Lords Prayer in the usual fashion (pgs 140-143)</w:t>
       </w:r>
     </w:p>
-    <w:bookmarkEnd w:id="50"/>
-    <w:bookmarkStart w:id="51" w:name="after-communion"/>
+    <w:bookmarkEnd w:id="51"/>
+    <w:bookmarkStart w:id="52" w:name="after-communion"/>
     <w:p>
       <w:pPr>
         <w:pStyle w:val="Heading2"/>
@@ -8815,8 +8819,8 @@
         <w:t xml:space="preserve">have received communion.</w:t>
       </w:r>
     </w:p>
-    <w:bookmarkEnd w:id="51"/>
-    <w:bookmarkStart w:id="52" w:name="litany-of-thanksgiving"/>
+    <w:bookmarkEnd w:id="52"/>
+    <w:bookmarkStart w:id="53" w:name="litany-of-thanksgiving"/>
     <w:p>
       <w:pPr>
         <w:pStyle w:val="Heading2"/>
@@ -8845,8 +8849,8 @@
         <w:t xml:space="preserve">Litany of Thanksgiving</w:t>
       </w:r>
     </w:p>
-    <w:bookmarkEnd w:id="52"/>
-    <w:bookmarkStart w:id="53" w:name="final-blessing-and-many-years"/>
+    <w:bookmarkEnd w:id="53"/>
+    <w:bookmarkStart w:id="54" w:name="final-blessing-and-many-years"/>
     <w:p>
       <w:pPr>
         <w:pStyle w:val="Heading2"/>
@@ -8875,8 +8879,8 @@
         <w:t xml:space="preserve">Final blessing and Many Years</w:t>
       </w:r>
     </w:p>
-    <w:bookmarkEnd w:id="53"/>
-    <w:bookmarkStart w:id="54" w:name="conclusion"/>
+    <w:bookmarkEnd w:id="54"/>
+    <w:bookmarkStart w:id="55" w:name="conclusion"/>
     <w:p>
       <w:pPr>
         <w:pStyle w:val="Heading2"/>
@@ -8905,8 +8909,8 @@
         <w:t xml:space="preserve">Conclusion</w:t>
       </w:r>
     </w:p>
-    <w:bookmarkEnd w:id="54"/>
     <w:bookmarkEnd w:id="55"/>
+    <w:bookmarkEnd w:id="56"/>
     <w:sectPr>
       <w:footnotePr>
         <w:numRestart w:val="eachSect"/>

</xml_diff>

<commit_message>
Publish: poster frames, section reset, and four appendices
The rubric page now opens each section with a still from that section rather
than 34 embeds wearing the same YouTube thumbnail. Clicking one builds the
player; it tears down at the section end or on "Back to the start", putting
the still back. Nothing is fetched from YouTube — not even the API — until a
reader clicks.

Four appendices from the sheet, lettered in the contents and linkable:
glossary, assigning the roles, the role of altar servers, and serving with
more or less than two deacons.

All 34 chapters keep their id, title, timecode and player span, so links
already in circulation still land where they did.

Co-Authored-By: Claude Opus 5 <noreply@anthropic.com>
</commit_message>
<xml_diff>
--- a/docs/rubric.docx
+++ b/docs/rubric.docx
@@ -2,7 +2,7 @@
 <file path=word/document.xml><?xml version="1.0" encoding="utf-8"?>
 <w:document xmlns:w="http://schemas.openxmlformats.org/wordprocessingml/2006/main" xmlns:m="http://schemas.openxmlformats.org/officeDocument/2006/math" xmlns:r="http://schemas.openxmlformats.org/officeDocument/2006/relationships" xmlns:o="urn:schemas-microsoft-com:office:office" xmlns:v="urn:schemas-microsoft-com:vml" xmlns:w10="urn:schemas-microsoft-com:office:word" xmlns:a="http://schemas.openxmlformats.org/drawingml/2006/main" xmlns:pic="http://schemas.openxmlformats.org/drawingml/2006/picture" xmlns:wp="http://schemas.openxmlformats.org/drawingml/2006/wordprocessingDrawing">
   <w:body>
-    <w:bookmarkStart w:id="56" w:name="Xff0d1af36d128fe5e5841074e6968ba97ba9259"/>
+    <w:bookmarkStart w:id="59" w:name="Xff0d1af36d128fe5e5841074e6968ba97ba9259"/>
     <w:p>
       <w:pPr>
         <w:pStyle w:val="Heading1"/>
@@ -145,14 +145,28 @@
         <w:t xml:space="preserve">time of the whole service.</w:t>
       </w:r>
     </w:p>
+    <w:p>
+      <w:pPr>
+        <w:pStyle w:val="BodyText"/>
+      </w:pPr>
+      <w:r>
+        <w:t xml:space="preserve">There are also useful appendixes at the end of the document (see the</w:t>
+      </w:r>
+      <w:r>
+        <w:t xml:space="preserve"> </w:t>
+      </w:r>
+      <w:r>
+        <w:t xml:space="preserve">table of contents)</w:t>
+      </w:r>
+    </w:p>
     <w:bookmarkEnd w:id="12"/>
-    <w:bookmarkStart w:id="13" w:name="assigning-the-roles"/>
+    <w:bookmarkStart w:id="13" w:name="help-us-make-this-better"/>
     <w:p>
       <w:pPr>
         <w:pStyle w:val="Heading2"/>
       </w:pPr>
       <w:r>
-        <w:t xml:space="preserve">Assigning The Roles</w:t>
+        <w:t xml:space="preserve">Help us Make this better!</w:t>
       </w:r>
     </w:p>
     <w:p>
@@ -160,100 +174,6 @@
         <w:pStyle w:val="FirstParagraph"/>
       </w:pPr>
       <w:r>
-        <w:t xml:space="preserve">The rubrics below call on subdeacons throughout. You may have to</w:t>
-      </w:r>
-      <w:r>
-        <w:t xml:space="preserve"> </w:t>
-      </w:r>
-      <w:r>
-        <w:t xml:space="preserve">appoint one or even two subdeacons choosing adult, experienced</w:t>
-      </w:r>
-      <w:r>
-        <w:t xml:space="preserve"> </w:t>
-      </w:r>
-      <w:r>
-        <w:t xml:space="preserve">altar servers for the role. They should be vested and know the</w:t>
-      </w:r>
-      <w:r>
-        <w:t xml:space="preserve"> </w:t>
-      </w:r>
-      <w:r>
-        <w:t xml:space="preserve">whole sequence beforehand — this is not a role to hand to someone</w:t>
-      </w:r>
-      <w:r>
-        <w:t xml:space="preserve"> </w:t>
-      </w:r>
-      <w:r>
-        <w:t xml:space="preserve">on the day. Another option is to have deacons act as subdeacons.</w:t>
-      </w:r>
-    </w:p>
-    <w:p>
-      <w:pPr>
-        <w:pStyle w:val="BodyText"/>
-      </w:pPr>
-      <w:r>
-        <w:t xml:space="preserve">Another important role, is the altar server who will bring out the</w:t>
-      </w:r>
-      <w:r>
-        <w:t xml:space="preserve"> </w:t>
-      </w:r>
-      <w:r>
-        <w:t xml:space="preserve">bowl, pitcher and towel for the washing of the Bishops hands.</w:t>
-      </w:r>
-      <w:r>
-        <w:t xml:space="preserve"> </w:t>
-      </w:r>
-      <w:r>
-        <w:t xml:space="preserve">Usually this is a junior server who will be greatly encouraged by</w:t>
-      </w:r>
-      <w:r>
-        <w:t xml:space="preserve"> </w:t>
-      </w:r>
-      <w:r>
-        <w:t xml:space="preserve">playing this important role.</w:t>
-      </w:r>
-    </w:p>
-    <w:p>
-      <w:pPr>
-        <w:pStyle w:val="BodyText"/>
-      </w:pPr>
-      <w:r>
-        <w:t xml:space="preserve">Having two more adult servers who will keep an eye on things on</w:t>
-      </w:r>
-      <w:r>
-        <w:t xml:space="preserve"> </w:t>
-      </w:r>
-      <w:r>
-        <w:t xml:space="preserve">the north and south sides of the altar is a good idea. They should</w:t>
-      </w:r>
-      <w:r>
-        <w:t xml:space="preserve"> </w:t>
-      </w:r>
-      <w:r>
-        <w:t xml:space="preserve">watch the subdeacons for direction, and can be a great help in</w:t>
-      </w:r>
-      <w:r>
-        <w:t xml:space="preserve"> </w:t>
-      </w:r>
-      <w:r>
-        <w:t xml:space="preserve">keeping things running smoothly by paying attention.</w:t>
-      </w:r>
-    </w:p>
-    <w:bookmarkEnd w:id="13"/>
-    <w:bookmarkStart w:id="14" w:name="help-us-make-this-better"/>
-    <w:p>
-      <w:pPr>
-        <w:pStyle w:val="Heading2"/>
-      </w:pPr>
-      <w:r>
-        <w:t xml:space="preserve">Help us Make this better!</w:t>
-      </w:r>
-    </w:p>
-    <w:p>
-      <w:pPr>
-        <w:pStyle w:val="FirstParagraph"/>
-      </w:pPr>
-      <w:r>
         <w:t xml:space="preserve">This site came out of the 2026 Diocese of NY and NJ Deaconal</w:t>
       </w:r>
       <w:r>
@@ -297,7 +217,7 @@
         <w:rPr>
           <w:rStyle w:val="VerbatimChar"/>
         </w:rPr>
-        <w:t xml:space="preserve">generated 25 Aug 2026, 02:33 · 45fd66c</w:t>
+        <w:t xml:space="preserve">generated 25 Aug 2026, 14:30 · bb8f6c9</w:t>
       </w:r>
     </w:p>
     <w:p>
@@ -315,8 +235,8 @@
         </w:pict>
       </w:r>
     </w:p>
-    <w:bookmarkEnd w:id="14"/>
-    <w:bookmarkStart w:id="15" w:name="contents"/>
+    <w:bookmarkEnd w:id="13"/>
+    <w:bookmarkStart w:id="14" w:name="contents"/>
     <w:p>
       <w:pPr>
         <w:pStyle w:val="Heading2"/>
@@ -732,6 +652,30 @@
       <w:r>
         <w:t xml:space="preserve">Conclusion · 59:06</w:t>
       </w:r>
+      <w:r>
+        <w:t xml:space="preserve"> </w:t>
+      </w:r>
+      <w:r>
+        <w:t xml:space="preserve">A. Glossary</w:t>
+      </w:r>
+      <w:r>
+        <w:t xml:space="preserve"> </w:t>
+      </w:r>
+      <w:r>
+        <w:t xml:space="preserve">B. Assigning The Roles</w:t>
+      </w:r>
+      <w:r>
+        <w:t xml:space="preserve"> </w:t>
+      </w:r>
+      <w:r>
+        <w:t xml:space="preserve">C. The role of Altar servers</w:t>
+      </w:r>
+      <w:r>
+        <w:t xml:space="preserve"> </w:t>
+      </w:r>
+      <w:r>
+        <w:t xml:space="preserve">D. Serving with More or Less than Two Deacons</w:t>
+      </w:r>
     </w:p>
     <w:p>
       <w:r>
@@ -772,8 +716,8 @@
         <w:t xml:space="preserve">Page references are from St. Tikhon’s Hieratikon Vol 2, 2017</w:t>
       </w:r>
     </w:p>
-    <w:bookmarkEnd w:id="15"/>
-    <w:bookmarkStart w:id="19" w:name="greeting-of-the-hierarch-at-the-doors"/>
+    <w:bookmarkEnd w:id="14"/>
+    <w:bookmarkStart w:id="18" w:name="greeting-of-the-hierarch-at-the-doors"/>
     <w:p>
       <w:pPr>
         <w:pStyle w:val="Heading2"/>
@@ -831,18 +775,18 @@
           <wp:inline>
             <wp:extent cx="5334000" cy="3000375"/>
             <wp:effectExtent b="0" l="0" r="0" t="0"/>
-            <wp:docPr descr="Greeting of the Hierarch at the Doors — plan" title="" id="17" name="Picture"/>
+            <wp:docPr descr="Greeting of the Hierarch at the Doors — plan" title="" id="16" name="Picture"/>
             <a:graphic>
               <a:graphicData uri="http://schemas.openxmlformats.org/drawingml/2006/picture">
                 <pic:pic>
                   <pic:nvPicPr>
-                    <pic:cNvPr descr="../art/greeting_plan.png" id="18" name="Picture"/>
+                    <pic:cNvPr descr="../art/greeting_plan.png" id="17" name="Picture"/>
                     <pic:cNvPicPr>
                       <a:picLocks noChangeArrowheads="1" noChangeAspect="1"/>
                     </pic:cNvPicPr>
                   </pic:nvPicPr>
                   <pic:blipFill>
-                    <a:blip r:embed="rId16"/>
+                    <a:blip r:embed="rId15"/>
                     <a:stretch>
                       <a:fillRect/>
                     </a:stretch>
@@ -1077,8 +1021,8 @@
         <w:t xml:space="preserve">At the conclusion, the priest presents the cross</w:t>
       </w:r>
     </w:p>
-    <w:bookmarkEnd w:id="19"/>
-    <w:bookmarkStart w:id="20" w:name="the-bishop-enters-the-nave"/>
+    <w:bookmarkEnd w:id="18"/>
+    <w:bookmarkStart w:id="19" w:name="the-bishop-enters-the-nave"/>
     <w:p>
       <w:pPr>
         <w:pStyle w:val="Heading2"/>
@@ -1236,13 +1180,29 @@
         </w:rPr>
         <w:t xml:space="preserve">0:30</w:t>
       </w:r>
-    </w:p>
-    <w:p>
-      <w:pPr>
-        <w:pStyle w:val="BodyText"/>
-      </w:pPr>
-      <w:r>
-        <w:t xml:space="preserve">Deacons turn around and walk forward toward cathedra</w:t>
+      <w:r>
+        <w:t xml:space="preserve"> </w:t>
+      </w:r>
+      <w:r>
+        <w:t xml:space="preserve">·</w:t>
+      </w:r>
+      <w:r>
+        <w:t xml:space="preserve"> </w:t>
+      </w:r>
+      <w:r>
+        <w:rPr>
+          <w:b/>
+          <w:bCs/>
+        </w:rPr>
+        <w:t xml:space="preserve">DEACONS</w:t>
+      </w:r>
+    </w:p>
+    <w:p>
+      <w:pPr>
+        <w:pStyle w:val="BodyText"/>
+      </w:pPr>
+      <w:r>
+        <w:t xml:space="preserve">turn around and walk forward toward cathedra</w:t>
       </w:r>
     </w:p>
     <w:p>
@@ -1298,13 +1258,29 @@
         </w:rPr>
         <w:t xml:space="preserve">0:42</w:t>
       </w:r>
-    </w:p>
-    <w:p>
-      <w:pPr>
-        <w:pStyle w:val="BodyText"/>
-      </w:pPr>
-      <w:r>
-        <w:t xml:space="preserve">Deacons walk past cathedra, turn around and continue to cense the Bishop</w:t>
+      <w:r>
+        <w:t xml:space="preserve"> </w:t>
+      </w:r>
+      <w:r>
+        <w:t xml:space="preserve">·</w:t>
+      </w:r>
+      <w:r>
+        <w:t xml:space="preserve"> </w:t>
+      </w:r>
+      <w:r>
+        <w:rPr>
+          <w:b/>
+          <w:bCs/>
+        </w:rPr>
+        <w:t xml:space="preserve">DEACONS</w:t>
+      </w:r>
+    </w:p>
+    <w:p>
+      <w:pPr>
+        <w:pStyle w:val="BodyText"/>
+      </w:pPr>
+      <w:r>
+        <w:t xml:space="preserve">walk past cathedra, turn around and continue to cense the Bishop</w:t>
       </w:r>
     </w:p>
     <w:p>
@@ -1332,6 +1308,42 @@
           <w:b/>
           <w:bCs/>
         </w:rPr>
+        <w:t xml:space="preserve">DEACONS, SERVERS</w:t>
+      </w:r>
+    </w:p>
+    <w:p>
+      <w:pPr>
+        <w:pStyle w:val="BodyText"/>
+      </w:pPr>
+      <w:r>
+        <w:t xml:space="preserve">turn towards the altar, as Bishop walks past, giving their censers away</w:t>
+      </w:r>
+    </w:p>
+    <w:p>
+      <w:pPr>
+        <w:pStyle w:val="BodyText"/>
+      </w:pPr>
+      <w:r>
+        <w:rPr>
+          <w:b/>
+          <w:bCs/>
+        </w:rPr>
+        <w:t xml:space="preserve">1:00</w:t>
+      </w:r>
+      <w:r>
+        <w:t xml:space="preserve"> </w:t>
+      </w:r>
+      <w:r>
+        <w:t xml:space="preserve">·</w:t>
+      </w:r>
+      <w:r>
+        <w:t xml:space="preserve"> </w:t>
+      </w:r>
+      <w:r>
+        <w:rPr>
+          <w:b/>
+          <w:bCs/>
+        </w:rPr>
         <w:t xml:space="preserve">SERVERS</w:t>
       </w:r>
     </w:p>
@@ -1340,19 +1352,19 @@
         <w:pStyle w:val="BodyText"/>
       </w:pPr>
       <w:r>
-        <w:t xml:space="preserve">Deacons turn towards the altar, as Bishop walks past, giving their censers away</w:t>
-      </w:r>
-    </w:p>
-    <w:p>
-      <w:pPr>
-        <w:pStyle w:val="BodyText"/>
-      </w:pPr>
-      <w:r>
-        <w:rPr>
-          <w:b/>
-          <w:bCs/>
-        </w:rPr>
-        <w:t xml:space="preserve">1:00</w:t>
+        <w:t xml:space="preserve">The server holding the train takes the staff, and the Bishop will greet the icons</w:t>
+      </w:r>
+    </w:p>
+    <w:p>
+      <w:pPr>
+        <w:pStyle w:val="BodyText"/>
+      </w:pPr>
+      <w:r>
+        <w:rPr>
+          <w:b/>
+          <w:bCs/>
+        </w:rPr>
+        <w:t xml:space="preserve">1:04</w:t>
       </w:r>
       <w:r>
         <w:t xml:space="preserve"> </w:t>
@@ -1376,47 +1388,11 @@
         <w:pStyle w:val="BodyText"/>
       </w:pPr>
       <w:r>
-        <w:t xml:space="preserve">The server holding the train takes the staff, and the Bishop will greet the icons</w:t>
-      </w:r>
-    </w:p>
-    <w:p>
-      <w:pPr>
-        <w:pStyle w:val="BodyText"/>
-      </w:pPr>
-      <w:r>
-        <w:rPr>
-          <w:b/>
-          <w:bCs/>
-        </w:rPr>
-        <w:t xml:space="preserve">1:04</w:t>
-      </w:r>
-      <w:r>
-        <w:t xml:space="preserve"> </w:t>
-      </w:r>
-      <w:r>
-        <w:t xml:space="preserve">·</w:t>
-      </w:r>
-      <w:r>
-        <w:t xml:space="preserve"> </w:t>
-      </w:r>
-      <w:r>
-        <w:rPr>
-          <w:b/>
-          <w:bCs/>
-        </w:rPr>
-        <w:t xml:space="preserve">SERVERS</w:t>
-      </w:r>
-    </w:p>
-    <w:p>
-      <w:pPr>
-        <w:pStyle w:val="BodyText"/>
-      </w:pPr>
-      <w:r>
         <w:t xml:space="preserve">The two servers holding the censers return them to the altar</w:t>
       </w:r>
     </w:p>
-    <w:bookmarkEnd w:id="20"/>
-    <w:bookmarkStart w:id="21" w:name="entrance-prayers"/>
+    <w:bookmarkEnd w:id="19"/>
+    <w:bookmarkStart w:id="20" w:name="entrance-prayers"/>
     <w:p>
       <w:pPr>
         <w:pStyle w:val="Heading2"/>
@@ -1493,8 +1469,8 @@
         <w:t xml:space="preserve">“I will enter thy house”</w:t>
       </w:r>
     </w:p>
-    <w:bookmarkEnd w:id="21"/>
-    <w:bookmarkStart w:id="22" w:name="preparing-to-vest-the-bishop"/>
+    <w:bookmarkEnd w:id="20"/>
+    <w:bookmarkStart w:id="21" w:name="preparing-to-vest-the-bishop"/>
     <w:p>
       <w:pPr>
         <w:pStyle w:val="Heading2"/>
@@ -1663,8 +1639,8 @@
         <w:t xml:space="preserve">retrieve loaded censers from north and south doors</w:t>
       </w:r>
     </w:p>
-    <w:bookmarkEnd w:id="22"/>
-    <w:bookmarkStart w:id="23" w:name="vesting-the-bishop"/>
+    <w:bookmarkEnd w:id="21"/>
+    <w:bookmarkStart w:id="22" w:name="vesting-the-bishop"/>
     <w:p>
       <w:pPr>
         <w:pStyle w:val="Heading2"/>
@@ -2067,8 +2043,8 @@
         <w:t xml:space="preserve">During the vesting the deacons continuously cense the Bishop.</w:t>
       </w:r>
     </w:p>
-    <w:bookmarkEnd w:id="23"/>
-    <w:bookmarkStart w:id="24" w:name="the-blessing-of-the-dikiri-and-trikiri"/>
+    <w:bookmarkEnd w:id="22"/>
+    <w:bookmarkStart w:id="23" w:name="the-blessing-of-the-dikiri-and-trikiri"/>
     <w:p>
       <w:pPr>
         <w:pStyle w:val="Heading2"/>
@@ -2096,15 +2072,11 @@
       <w:r>
         <w:t xml:space="preserve">The Blessing of the Dikiri and Trikiri</w:t>
       </w:r>
-      <w:r>
-        <w:t xml:space="preserve"> </w:t>
-      </w:r>
-      <w:r>
-        <w:t xml:space="preserve">***</w:t>
-      </w:r>
-      <w:r>
-        <w:t xml:space="preserve"> </w:t>
-      </w:r>
+    </w:p>
+    <w:p>
+      <w:pPr>
+        <w:pStyle w:val="BlockText"/>
+      </w:pPr>
       <w:r>
         <w:t xml:space="preserve">As the cross and Encolpion are placed,</w:t>
       </w:r>
@@ -2436,8 +2408,8 @@
         <w:t xml:space="preserve">bowing first to the altar, then to the Bishop</w:t>
       </w:r>
     </w:p>
-    <w:bookmarkEnd w:id="24"/>
-    <w:bookmarkStart w:id="25" w:name="final-prayers-before-the-liturgy"/>
+    <w:bookmarkEnd w:id="23"/>
+    <w:bookmarkStart w:id="24" w:name="final-prayers-before-the-liturgy"/>
     <w:p>
       <w:pPr>
         <w:pStyle w:val="Heading2"/>
@@ -2796,8 +2768,8 @@
         <w:t xml:space="preserve">note: this is done before each litany by both deacons, remember get a blessing to proceed</w:t>
       </w:r>
     </w:p>
-    <w:bookmarkEnd w:id="25"/>
-    <w:bookmarkStart w:id="26" w:name="washing-of-the-hands"/>
+    <w:bookmarkEnd w:id="24"/>
+    <w:bookmarkStart w:id="25" w:name="washing-of-the-hands"/>
     <w:p>
       <w:pPr>
         <w:pStyle w:val="Heading2"/>
@@ -2940,8 +2912,8 @@
         <w:t xml:space="preserve">moves forward to stand before the Theotokos</w:t>
       </w:r>
     </w:p>
-    <w:bookmarkEnd w:id="26"/>
-    <w:bookmarkStart w:id="27" w:name="X47a719300886e5c33c0e97daeae1e65b8508ca8"/>
+    <w:bookmarkEnd w:id="25"/>
+    <w:bookmarkStart w:id="26" w:name="X47a719300886e5c33c0e97daeae1e65b8508ca8"/>
     <w:p>
       <w:pPr>
         <w:pStyle w:val="Heading2"/>
@@ -3098,8 +3070,8 @@
         <w:t xml:space="preserve">As the first antiphon concludes, bow to the icon, and then to the Bishop</w:t>
       </w:r>
     </w:p>
-    <w:bookmarkEnd w:id="27"/>
-    <w:bookmarkStart w:id="28" w:name="the-second-antiphon"/>
+    <w:bookmarkEnd w:id="26"/>
+    <w:bookmarkStart w:id="27" w:name="the-second-antiphon"/>
     <w:p>
       <w:pPr>
         <w:pStyle w:val="Heading2"/>
@@ -3152,8 +3124,8 @@
         <w:t xml:space="preserve">The third Litany is chanted as usual.</w:t>
       </w:r>
     </w:p>
-    <w:bookmarkEnd w:id="28"/>
-    <w:bookmarkStart w:id="29" w:name="the-beginning-of-the-little-entrance"/>
+    <w:bookmarkEnd w:id="27"/>
+    <w:bookmarkStart w:id="28" w:name="the-beginning-of-the-little-entrance"/>
     <w:p>
       <w:pPr>
         <w:pStyle w:val="Heading2"/>
@@ -3620,8 +3592,8 @@
         <w:t xml:space="preserve">everyone is now facing each other with the Bishop at the center</w:t>
       </w:r>
     </w:p>
-    <w:bookmarkEnd w:id="29"/>
-    <w:bookmarkStart w:id="30" w:name="the-conclusion-of-the-little-entrance"/>
+    <w:bookmarkEnd w:id="28"/>
+    <w:bookmarkStart w:id="29" w:name="the-conclusion-of-the-little-entrance"/>
     <w:p>
       <w:pPr>
         <w:pStyle w:val="Heading2"/>
@@ -3898,8 +3870,8 @@
         <w:t xml:space="preserve">Dikiri and Trikiri</w:t>
       </w:r>
     </w:p>
-    <w:bookmarkEnd w:id="30"/>
-    <w:bookmarkStart w:id="31" w:name="X2e49296d3ebe6e04154a558d167af870e7506bb"/>
+    <w:bookmarkEnd w:id="29"/>
+    <w:bookmarkStart w:id="30" w:name="X2e49296d3ebe6e04154a558d167af870e7506bb"/>
     <w:p>
       <w:pPr>
         <w:pStyle w:val="Heading2"/>
@@ -3998,8 +3970,8 @@
         <w:t xml:space="preserve">A server takes the Dikiri, while the first deacon takes the censer.</w:t>
       </w:r>
     </w:p>
-    <w:bookmarkEnd w:id="31"/>
-    <w:bookmarkStart w:id="32" w:name="X3e90ce30e5a043d255ce9c37e6bb0da9a6e8181"/>
+    <w:bookmarkEnd w:id="30"/>
+    <w:bookmarkStart w:id="31" w:name="X3e90ce30e5a043d255ce9c37e6bb0da9a6e8181"/>
     <w:p>
       <w:pPr>
         <w:pStyle w:val="Heading2"/>
@@ -4468,8 +4440,8 @@
         <w:t xml:space="preserve">to the Bishop</w:t>
       </w:r>
     </w:p>
-    <w:bookmarkEnd w:id="32"/>
-    <w:bookmarkStart w:id="33" w:name="conclusion-of-thrice-holy"/>
+    <w:bookmarkEnd w:id="31"/>
+    <w:bookmarkStart w:id="32" w:name="conclusion-of-thrice-holy"/>
     <w:p>
       <w:pPr>
         <w:pStyle w:val="Heading2"/>
@@ -4570,8 +4542,8 @@
         <w:t xml:space="preserve">cross facing the people.</w:t>
       </w:r>
     </w:p>
-    <w:bookmarkEnd w:id="33"/>
-    <w:bookmarkStart w:id="34" w:name="lesser-censing-and-epistle-reading"/>
+    <w:bookmarkEnd w:id="32"/>
+    <w:bookmarkStart w:id="33" w:name="lesser-censing-and-epistle-reading"/>
     <w:p>
       <w:pPr>
         <w:pStyle w:val="Heading2"/>
@@ -4925,8 +4897,8 @@
         <w:t xml:space="preserve">Bishop, and gives away the censer.</w:t>
       </w:r>
     </w:p>
-    <w:bookmarkEnd w:id="34"/>
-    <w:bookmarkStart w:id="35" w:name="alleluias-and-the-gospel-book-goes-out"/>
+    <w:bookmarkEnd w:id="33"/>
+    <w:bookmarkStart w:id="34" w:name="alleluias-and-the-gospel-book-goes-out"/>
     <w:p>
       <w:pPr>
         <w:pStyle w:val="Heading2"/>
@@ -5093,8 +5065,8 @@
         <w:t xml:space="preserve">Two deacons should cross beside each other.</w:t>
       </w:r>
     </w:p>
-    <w:bookmarkEnd w:id="35"/>
-    <w:bookmarkStart w:id="36" w:name="reading-of-the-gospel"/>
+    <w:bookmarkEnd w:id="34"/>
+    <w:bookmarkStart w:id="35" w:name="reading-of-the-gospel"/>
     <w:p>
       <w:pPr>
         <w:pStyle w:val="Heading2"/>
@@ -5329,8 +5301,8 @@
         <w:t xml:space="preserve">presents Omophoron to the Bishop to kiss.</w:t>
       </w:r>
     </w:p>
-    <w:bookmarkEnd w:id="36"/>
-    <w:bookmarkStart w:id="37" w:name="gospel-is-returned-to-the-altar"/>
+    <w:bookmarkEnd w:id="35"/>
+    <w:bookmarkStart w:id="36" w:name="gospel-is-returned-to-the-altar"/>
     <w:p>
       <w:pPr>
         <w:pStyle w:val="Heading2"/>
@@ -5485,8 +5457,8 @@
         <w:t xml:space="preserve">and kisses the altar</w:t>
       </w:r>
     </w:p>
-    <w:bookmarkEnd w:id="37"/>
-    <w:bookmarkStart w:id="38" w:name="augmented-litany-begins"/>
+    <w:bookmarkEnd w:id="36"/>
+    <w:bookmarkStart w:id="37" w:name="augmented-litany-begins"/>
     <w:p>
       <w:pPr>
         <w:pStyle w:val="Heading2"/>
@@ -5521,8 +5493,8 @@
         <w:t xml:space="preserve">after the Sermon as usual</w:t>
       </w:r>
     </w:p>
-    <w:bookmarkEnd w:id="38"/>
-    <w:bookmarkStart w:id="39" w:name="X0a86f6eccd19f643567f3589c71dc197395a421"/>
+    <w:bookmarkEnd w:id="37"/>
+    <w:bookmarkStart w:id="38" w:name="X0a86f6eccd19f643567f3589c71dc197395a421"/>
     <w:p>
       <w:pPr>
         <w:pStyle w:val="Heading2"/>
@@ -6133,8 +6105,8 @@
         <w:t xml:space="preserve">and the people.</w:t>
       </w:r>
     </w:p>
-    <w:bookmarkEnd w:id="39"/>
-    <w:bookmarkStart w:id="40" w:name="clergy-kissing-the-bishops-shoulder"/>
+    <w:bookmarkEnd w:id="38"/>
+    <w:bookmarkStart w:id="39" w:name="clergy-kissing-the-bishops-shoulder"/>
     <w:p>
       <w:pPr>
         <w:pStyle w:val="Heading2"/>
@@ -6183,8 +6155,8 @@
         <w:t xml:space="preserve">shoulder.</w:t>
       </w:r>
     </w:p>
-    <w:bookmarkEnd w:id="40"/>
-    <w:bookmarkStart w:id="41" w:name="the-bishop-makes-his-commemorations"/>
+    <w:bookmarkEnd w:id="39"/>
+    <w:bookmarkStart w:id="40" w:name="the-bishop-makes-his-commemorations"/>
     <w:p>
       <w:pPr>
         <w:pStyle w:val="Heading2"/>
@@ -6255,8 +6227,8 @@
         <w:t xml:space="preserve">complete the Proskomedia with the Bishop.</w:t>
       </w:r>
     </w:p>
-    <w:bookmarkEnd w:id="41"/>
-    <w:bookmarkStart w:id="45" w:name="X522bcda74686242fb49172324eb7ed4b78a907a"/>
+    <w:bookmarkEnd w:id="40"/>
+    <w:bookmarkStart w:id="44" w:name="X522bcda74686242fb49172324eb7ed4b78a907a"/>
     <w:p>
       <w:pPr>
         <w:pStyle w:val="Heading2"/>
@@ -6294,18 +6266,18 @@
           <wp:inline>
             <wp:extent cx="5334000" cy="3000375"/>
             <wp:effectExtent b="0" l="0" r="0" t="0"/>
-            <wp:docPr descr="The Great Entrance — positions" title="" id="43" name="Picture"/>
+            <wp:docPr descr="The Great Entrance — positions" title="" id="42" name="Picture"/>
             <a:graphic>
               <a:graphicData uri="http://schemas.openxmlformats.org/drawingml/2006/picture">
                 <pic:pic>
                   <pic:nvPicPr>
-                    <pic:cNvPr descr="../art/great_entrance_plan.png" id="44" name="Picture"/>
+                    <pic:cNvPr descr="../art/great_entrance_plan.png" id="43" name="Picture"/>
                     <pic:cNvPicPr>
                       <a:picLocks noChangeArrowheads="1" noChangeAspect="1"/>
                     </pic:cNvPicPr>
                   </pic:nvPicPr>
                   <pic:blipFill>
-                    <a:blip r:embed="rId42"/>
+                    <a:blip r:embed="rId41"/>
                     <a:stretch>
                       <a:fillRect/>
                     </a:stretch>
@@ -7072,8 +7044,8 @@
         <w:t xml:space="preserve">outside the sanctuary during the Great Entrance.</w:t>
       </w:r>
     </w:p>
-    <w:bookmarkEnd w:id="45"/>
-    <w:bookmarkStart w:id="46" w:name="conclusion-of-the-great-entrance"/>
+    <w:bookmarkEnd w:id="44"/>
+    <w:bookmarkStart w:id="45" w:name="conclusion-of-the-great-entrance"/>
     <w:p>
       <w:pPr>
         <w:pStyle w:val="Heading2"/>
@@ -7212,8 +7184,8 @@
         <w:t xml:space="preserve">Altar.</w:t>
       </w:r>
     </w:p>
-    <w:bookmarkEnd w:id="46"/>
-    <w:bookmarkStart w:id="47" w:name="litany-of-supplication-and-the-creed"/>
+    <w:bookmarkEnd w:id="45"/>
+    <w:bookmarkStart w:id="46" w:name="litany-of-supplication-and-the-creed"/>
     <w:p>
       <w:pPr>
         <w:pStyle w:val="Heading2"/>
@@ -7256,8 +7228,8 @@
         <w:t xml:space="preserve">the normal rubrics.</w:t>
       </w:r>
     </w:p>
-    <w:bookmarkEnd w:id="47"/>
-    <w:bookmarkStart w:id="48" w:name="the-anaphora-part-1"/>
+    <w:bookmarkEnd w:id="46"/>
+    <w:bookmarkStart w:id="47" w:name="the-anaphora-part-1"/>
     <w:p>
       <w:pPr>
         <w:pStyle w:val="Heading2"/>
@@ -7506,8 +7478,8 @@
         <w:t xml:space="preserve">the altar and hold the star as usual.</w:t>
       </w:r>
     </w:p>
-    <w:bookmarkEnd w:id="48"/>
-    <w:bookmarkStart w:id="49" w:name="the-anaphora-part-2"/>
+    <w:bookmarkEnd w:id="47"/>
+    <w:bookmarkStart w:id="48" w:name="the-anaphora-part-2"/>
     <w:p>
       <w:pPr>
         <w:pStyle w:val="Heading2"/>
@@ -7550,8 +7522,8 @@
         <w:t xml:space="preserve">the first deacon raising the chalice.</w:t>
       </w:r>
     </w:p>
-    <w:bookmarkEnd w:id="49"/>
-    <w:bookmarkStart w:id="50" w:name="the-anaphora-part-3"/>
+    <w:bookmarkEnd w:id="48"/>
+    <w:bookmarkStart w:id="49" w:name="the-anaphora-part-3"/>
     <w:p>
       <w:pPr>
         <w:pStyle w:val="Heading2"/>
@@ -7727,8 +7699,8 @@
         <w:t xml:space="preserve">(all said by the first deacon pg 134)</w:t>
       </w:r>
     </w:p>
-    <w:bookmarkEnd w:id="50"/>
-    <w:bookmarkStart w:id="51" w:name="the-anaphora-part-4"/>
+    <w:bookmarkEnd w:id="49"/>
+    <w:bookmarkStart w:id="50" w:name="the-anaphora-part-4"/>
     <w:p>
       <w:pPr>
         <w:pStyle w:val="Heading2"/>
@@ -8741,8 +8713,8 @@
         <w:t xml:space="preserve">Lords Prayer in the usual fashion (pgs 140-143)</w:t>
       </w:r>
     </w:p>
-    <w:bookmarkEnd w:id="51"/>
-    <w:bookmarkStart w:id="52" w:name="after-communion"/>
+    <w:bookmarkEnd w:id="50"/>
+    <w:bookmarkStart w:id="51" w:name="after-communion"/>
     <w:p>
       <w:pPr>
         <w:pStyle w:val="Heading2"/>
@@ -8819,8 +8791,8 @@
         <w:t xml:space="preserve">have received communion.</w:t>
       </w:r>
     </w:p>
-    <w:bookmarkEnd w:id="52"/>
-    <w:bookmarkStart w:id="53" w:name="litany-of-thanksgiving"/>
+    <w:bookmarkEnd w:id="51"/>
+    <w:bookmarkStart w:id="52" w:name="litany-of-thanksgiving"/>
     <w:p>
       <w:pPr>
         <w:pStyle w:val="Heading2"/>
@@ -8849,8 +8821,8 @@
         <w:t xml:space="preserve">Litany of Thanksgiving</w:t>
       </w:r>
     </w:p>
-    <w:bookmarkEnd w:id="53"/>
-    <w:bookmarkStart w:id="54" w:name="final-blessing-and-many-years"/>
+    <w:bookmarkEnd w:id="52"/>
+    <w:bookmarkStart w:id="53" w:name="final-blessing-and-many-years"/>
     <w:p>
       <w:pPr>
         <w:pStyle w:val="Heading2"/>
@@ -8879,8 +8851,8 @@
         <w:t xml:space="preserve">Final blessing and Many Years</w:t>
       </w:r>
     </w:p>
-    <w:bookmarkEnd w:id="54"/>
-    <w:bookmarkStart w:id="55" w:name="conclusion"/>
+    <w:bookmarkEnd w:id="53"/>
+    <w:bookmarkStart w:id="54" w:name="conclusion"/>
     <w:p>
       <w:pPr>
         <w:pStyle w:val="Heading2"/>
@@ -8909,8 +8881,500 @@
         <w:t xml:space="preserve">Conclusion</w:t>
       </w:r>
     </w:p>
+    <w:bookmarkEnd w:id="54"/>
+    <w:bookmarkStart w:id="55" w:name="glossary"/>
+    <w:p>
+      <w:pPr>
+        <w:pStyle w:val="Heading2"/>
+      </w:pPr>
+      <w:r>
+        <w:t xml:space="preserve">Glossary</w:t>
+      </w:r>
+    </w:p>
+    <w:p>
+      <w:pPr>
+        <w:pStyle w:val="FirstParagraph"/>
+      </w:pPr>
+      <w:r>
+        <w:rPr>
+          <w:i/>
+          <w:iCs/>
+        </w:rPr>
+        <w:t xml:space="preserve">Appendix A</w:t>
+      </w:r>
+    </w:p>
+    <w:p>
+      <w:pPr>
+        <w:pStyle w:val="BodyText"/>
+      </w:pPr>
+      <w:r>
+        <w:rPr>
+          <w:b/>
+          <w:bCs/>
+        </w:rPr>
+        <w:t xml:space="preserve">Dikirion</w:t>
+      </w:r>
+      <w:r>
+        <w:t xml:space="preserve"> </w:t>
+      </w:r>
+      <w:r>
+        <w:t xml:space="preserve">— the two-branched candlestick, signifying the two</w:t>
+      </w:r>
+      <w:r>
+        <w:t xml:space="preserve"> </w:t>
+      </w:r>
+      <w:r>
+        <w:t xml:space="preserve">natures of Christ.</w:t>
+      </w:r>
+      <w:r>
+        <w:t xml:space="preserve"> </w:t>
+      </w:r>
+      <w:r>
+        <w:rPr>
+          <w:b/>
+          <w:bCs/>
+        </w:rPr>
+        <w:t xml:space="preserve">Trikirion</w:t>
+      </w:r>
+      <w:r>
+        <w:t xml:space="preserve"> </w:t>
+      </w:r>
+      <w:r>
+        <w:t xml:space="preserve">— the three-branched candlestick,</w:t>
+      </w:r>
+      <w:r>
+        <w:t xml:space="preserve"> </w:t>
+      </w:r>
+      <w:r>
+        <w:t xml:space="preserve">signifying the Trinity.</w:t>
+      </w:r>
+    </w:p>
+    <w:p>
+      <w:pPr>
+        <w:pStyle w:val="BodyText"/>
+      </w:pPr>
+      <w:r>
+        <w:rPr>
+          <w:b/>
+          <w:bCs/>
+        </w:rPr>
+        <w:t xml:space="preserve">Zhezl</w:t>
+      </w:r>
+      <w:r>
+        <w:t xml:space="preserve"> </w:t>
+      </w:r>
+      <w:r>
+        <w:t xml:space="preserve">— the bishop’s staff. Written</w:t>
+      </w:r>
+      <w:r>
+        <w:t xml:space="preserve"> </w:t>
+      </w:r>
+      <w:r>
+        <w:rPr>
+          <w:i/>
+          <w:iCs/>
+        </w:rPr>
+        <w:t xml:space="preserve">jezel</w:t>
+      </w:r>
+      <w:r>
+        <w:t xml:space="preserve"> </w:t>
+      </w:r>
+      <w:r>
+        <w:t xml:space="preserve">in some of the</w:t>
+      </w:r>
+      <w:r>
+        <w:t xml:space="preserve"> </w:t>
+      </w:r>
+      <w:r>
+        <w:t xml:space="preserve">notes; the same object is called simply</w:t>
+      </w:r>
+      <w:r>
+        <w:t xml:space="preserve"> </w:t>
+      </w:r>
+      <w:r>
+        <w:t xml:space="preserve">“the staff”</w:t>
+      </w:r>
+      <w:r>
+        <w:t xml:space="preserve"> </w:t>
+      </w:r>
+      <w:r>
+        <w:t xml:space="preserve">elsewhere, and</w:t>
+      </w:r>
+      <w:r>
+        <w:t xml:space="preserve"> </w:t>
+      </w:r>
+      <w:r>
+        <w:t xml:space="preserve">one spelling should win before this is published.</w:t>
+      </w:r>
+    </w:p>
+    <w:p>
+      <w:pPr>
+        <w:pStyle w:val="BodyText"/>
+      </w:pPr>
+      <w:r>
+        <w:rPr>
+          <w:b/>
+          <w:bCs/>
+        </w:rPr>
+        <w:t xml:space="preserve">Orlets</w:t>
+      </w:r>
+      <w:r>
+        <w:t xml:space="preserve"> </w:t>
+      </w:r>
+      <w:r>
+        <w:t xml:space="preserve">— the eagle rug the bishop stands on.</w:t>
+      </w:r>
+    </w:p>
     <w:bookmarkEnd w:id="55"/>
+    <w:bookmarkStart w:id="56" w:name="assigning-the-roles"/>
+    <w:p>
+      <w:pPr>
+        <w:pStyle w:val="Heading2"/>
+      </w:pPr>
+      <w:r>
+        <w:t xml:space="preserve">Assigning The Roles</w:t>
+      </w:r>
+    </w:p>
+    <w:p>
+      <w:pPr>
+        <w:pStyle w:val="FirstParagraph"/>
+      </w:pPr>
+      <w:r>
+        <w:rPr>
+          <w:i/>
+          <w:iCs/>
+        </w:rPr>
+        <w:t xml:space="preserve">Appendix B</w:t>
+      </w:r>
+    </w:p>
+    <w:p>
+      <w:pPr>
+        <w:pStyle w:val="BodyText"/>
+      </w:pPr>
+      <w:r>
+        <w:t xml:space="preserve">The rubrics above call on subdeacons throughout. You may have to</w:t>
+      </w:r>
+      <w:r>
+        <w:t xml:space="preserve"> </w:t>
+      </w:r>
+      <w:r>
+        <w:t xml:space="preserve">appoint one or even two subdeacons choosing adult, experienced</w:t>
+      </w:r>
+      <w:r>
+        <w:t xml:space="preserve"> </w:t>
+      </w:r>
+      <w:r>
+        <w:t xml:space="preserve">altar servers for the role. They should be vested and know the</w:t>
+      </w:r>
+      <w:r>
+        <w:t xml:space="preserve"> </w:t>
+      </w:r>
+      <w:r>
+        <w:t xml:space="preserve">whole sequence beforehand — this is not a role to hand to someone</w:t>
+      </w:r>
+      <w:r>
+        <w:t xml:space="preserve"> </w:t>
+      </w:r>
+      <w:r>
+        <w:t xml:space="preserve">on the day. Another option is to have deacons act as subdeacons.</w:t>
+      </w:r>
+    </w:p>
+    <w:p>
+      <w:pPr>
+        <w:pStyle w:val="BodyText"/>
+      </w:pPr>
+      <w:r>
+        <w:t xml:space="preserve">Another important role, is the altar server who will bring out the</w:t>
+      </w:r>
+      <w:r>
+        <w:t xml:space="preserve"> </w:t>
+      </w:r>
+      <w:r>
+        <w:t xml:space="preserve">bowl, pitcher and towel for the washing of the Bishops hands.</w:t>
+      </w:r>
+      <w:r>
+        <w:t xml:space="preserve"> </w:t>
+      </w:r>
+      <w:r>
+        <w:t xml:space="preserve">Usually this is a junior server who will be greatly encouraged by</w:t>
+      </w:r>
+      <w:r>
+        <w:t xml:space="preserve"> </w:t>
+      </w:r>
+      <w:r>
+        <w:t xml:space="preserve">playing this important role.</w:t>
+      </w:r>
+    </w:p>
+    <w:p>
+      <w:pPr>
+        <w:pStyle w:val="BodyText"/>
+      </w:pPr>
+      <w:r>
+        <w:t xml:space="preserve">Having two more adult servers who will keep an eye on things on</w:t>
+      </w:r>
+      <w:r>
+        <w:t xml:space="preserve"> </w:t>
+      </w:r>
+      <w:r>
+        <w:t xml:space="preserve">the north and south sides of the altar is a good idea. They should</w:t>
+      </w:r>
+      <w:r>
+        <w:t xml:space="preserve"> </w:t>
+      </w:r>
+      <w:r>
+        <w:t xml:space="preserve">watch the subdeacons for direction, and can be a great help in</w:t>
+      </w:r>
+      <w:r>
+        <w:t xml:space="preserve"> </w:t>
+      </w:r>
+      <w:r>
+        <w:t xml:space="preserve">keeping things running smoothly by paying attention.</w:t>
+      </w:r>
+    </w:p>
+    <w:p>
+      <w:pPr>
+        <w:pStyle w:val="BodyText"/>
+      </w:pPr>
+      <w:r>
+        <w:t xml:space="preserve">Additional altar servers can carry lamps in the entrances, and should</w:t>
+      </w:r>
+      <w:r>
+        <w:t xml:space="preserve"> </w:t>
+      </w:r>
+      <w:r>
+        <w:t xml:space="preserve">behind the other clergy and servers. See the little and great entrances</w:t>
+      </w:r>
+      <w:r>
+        <w:t xml:space="preserve"> </w:t>
+      </w:r>
+      <w:r>
+        <w:t xml:space="preserve">for details. Also try to line the servers up symmetrically if possible:</w:t>
+      </w:r>
+      <w:r>
+        <w:t xml:space="preserve"> </w:t>
+      </w:r>
+      <w:r>
+        <w:t xml:space="preserve">for example if you have two smaller boys carrying lamps and one larger boy,</w:t>
+      </w:r>
+      <w:r>
+        <w:t xml:space="preserve"> </w:t>
+      </w:r>
+      <w:r>
+        <w:t xml:space="preserve">the larger boy should be in the middle.</w:t>
+      </w:r>
+    </w:p>
     <w:bookmarkEnd w:id="56"/>
+    <w:bookmarkStart w:id="57" w:name="the-role-of-altar-servers"/>
+    <w:p>
+      <w:pPr>
+        <w:pStyle w:val="Heading2"/>
+      </w:pPr>
+      <w:r>
+        <w:t xml:space="preserve">The role of Altar servers</w:t>
+      </w:r>
+    </w:p>
+    <w:p>
+      <w:pPr>
+        <w:pStyle w:val="FirstParagraph"/>
+      </w:pPr>
+      <w:r>
+        <w:rPr>
+          <w:i/>
+          <w:iCs/>
+        </w:rPr>
+        <w:t xml:space="preserve">Appendix C</w:t>
+      </w:r>
+    </w:p>
+    <w:p>
+      <w:pPr>
+        <w:pStyle w:val="BodyText"/>
+      </w:pPr>
+      <w:r>
+        <w:t xml:space="preserve">The following analogy may be useful in helping younger boys to stay focused</w:t>
+      </w:r>
+      <w:r>
+        <w:t xml:space="preserve"> </w:t>
+      </w:r>
+      <w:r>
+        <w:t xml:space="preserve">and on task:</w:t>
+      </w:r>
+    </w:p>
+    <w:p>
+      <w:pPr>
+        <w:pStyle w:val="BodyText"/>
+      </w:pPr>
+      <w:r>
+        <w:t xml:space="preserve">Christians, and especially Orthodox Christians are like God’s special forces.</w:t>
+      </w:r>
+      <w:r>
+        <w:t xml:space="preserve"> </w:t>
+      </w:r>
+      <w:r>
+        <w:t xml:space="preserve">We are in the world taking back territory that has been stolen by the evil</w:t>
+      </w:r>
+      <w:r>
+        <w:t xml:space="preserve"> </w:t>
+      </w:r>
+      <w:r>
+        <w:t xml:space="preserve">one.</w:t>
+      </w:r>
+    </w:p>
+    <w:p>
+      <w:pPr>
+        <w:pStyle w:val="BodyText"/>
+      </w:pPr>
+      <w:r>
+        <w:t xml:space="preserve">The temple in which we meet is like a protected forward fort in enemy territory.</w:t>
+      </w:r>
+      <w:r>
+        <w:t xml:space="preserve"> </w:t>
+      </w:r>
+      <w:r>
+        <w:t xml:space="preserve">When we are in the temple, we are in a safe place, with more protection from</w:t>
+      </w:r>
+      <w:r>
+        <w:t xml:space="preserve"> </w:t>
+      </w:r>
+      <w:r>
+        <w:t xml:space="preserve">evil than in the outside world. We come to the temple to be healed from our</w:t>
+      </w:r>
+      <w:r>
+        <w:t xml:space="preserve"> </w:t>
+      </w:r>
+      <w:r>
+        <w:t xml:space="preserve">wounds, to rest, and to be trained for the next battle.</w:t>
+      </w:r>
+    </w:p>
+    <w:p>
+      <w:pPr>
+        <w:pStyle w:val="BodyText"/>
+      </w:pPr>
+      <w:r>
+        <w:t xml:space="preserve">But at any fort you will always have guards, and that is precisely what the</w:t>
+      </w:r>
+      <w:r>
+        <w:t xml:space="preserve"> </w:t>
+      </w:r>
+      <w:r>
+        <w:t xml:space="preserve">altar servers are. And the more alert and focused the servers on their duty</w:t>
+      </w:r>
+      <w:r>
+        <w:t xml:space="preserve"> </w:t>
+      </w:r>
+      <w:r>
+        <w:t xml:space="preserve">no matter how small it may seem, the harder time the enemy will have in attacking</w:t>
+      </w:r>
+      <w:r>
+        <w:t xml:space="preserve"> </w:t>
+      </w:r>
+      <w:r>
+        <w:t xml:space="preserve">our fort.</w:t>
+      </w:r>
+    </w:p>
+    <w:bookmarkEnd w:id="57"/>
+    <w:bookmarkStart w:id="58" w:name="X5aee2e88d629e526295b2657da9d1aa444f00b7"/>
+    <w:p>
+      <w:pPr>
+        <w:pStyle w:val="Heading2"/>
+      </w:pPr>
+      <w:r>
+        <w:t xml:space="preserve">Serving with More or Less than Two Deacons</w:t>
+      </w:r>
+    </w:p>
+    <w:p>
+      <w:pPr>
+        <w:pStyle w:val="FirstParagraph"/>
+      </w:pPr>
+      <w:r>
+        <w:rPr>
+          <w:i/>
+          <w:iCs/>
+        </w:rPr>
+        <w:t xml:space="preserve">Appendix D</w:t>
+      </w:r>
+    </w:p>
+    <w:p>
+      <w:pPr>
+        <w:pStyle w:val="BodyText"/>
+      </w:pPr>
+      <w:r>
+        <w:t xml:space="preserve">The rubrics throughout assume two deacons, which is the normal case</w:t>
+      </w:r>
+      <w:r>
+        <w:t xml:space="preserve"> </w:t>
+      </w:r>
+      <w:r>
+        <w:t xml:space="preserve">at a hierarchical liturgy. Where fewer are available the duties do</w:t>
+      </w:r>
+      <w:r>
+        <w:t xml:space="preserve"> </w:t>
+      </w:r>
+      <w:r>
+        <w:t xml:space="preserve">not disappear; they are reassigned.</w:t>
+      </w:r>
+    </w:p>
+    <w:p>
+      <w:pPr>
+        <w:pStyle w:val="BodyText"/>
+      </w:pPr>
+      <w:r>
+        <w:t xml:space="preserve">With one deacon, he takes the first deacon’s part throughout, and</w:t>
+      </w:r>
+      <w:r>
+        <w:t xml:space="preserve"> </w:t>
+      </w:r>
+      <w:r>
+        <w:t xml:space="preserve">the litanies that would alternate fall to him.</w:t>
+      </w:r>
+    </w:p>
+    <w:p>
+      <w:pPr>
+        <w:pStyle w:val="BodyText"/>
+      </w:pPr>
+      <w:r>
+        <w:t xml:space="preserve">Where there are no subdeacons, two senior altar servers should be</w:t>
+      </w:r>
+      <w:r>
+        <w:t xml:space="preserve"> </w:t>
+      </w:r>
+      <w:r>
+        <w:t xml:space="preserve">appointed to their duties, though they do not vest as subdeacons</w:t>
+      </w:r>
+      <w:r>
+        <w:t xml:space="preserve"> </w:t>
+      </w:r>
+      <w:r>
+        <w:t xml:space="preserve">and do not handle the dikirion and trikirion at the blessing.</w:t>
+      </w:r>
+    </w:p>
+    <w:p>
+      <w:pPr>
+        <w:pStyle w:val="BodyText"/>
+      </w:pPr>
+      <w:r>
+        <w:t xml:space="preserve">Where there are more than two deacons, the third and fourth deacons have</w:t>
+      </w:r>
+      <w:r>
+        <w:t xml:space="preserve"> </w:t>
+      </w:r>
+      <w:r>
+        <w:t xml:space="preserve">take some of the roles of the second deacon as well.</w:t>
+      </w:r>
+    </w:p>
+    <w:p>
+      <w:pPr>
+        <w:pStyle w:val="BodyText"/>
+      </w:pPr>
+      <w:r>
+        <w:rPr>
+          <w:i/>
+          <w:iCs/>
+        </w:rPr>
+        <w:t xml:space="preserve">TBD: the excellent pocket sized deacons role chart here.</w:t>
+      </w:r>
+    </w:p>
+    <w:bookmarkEnd w:id="58"/>
+    <w:bookmarkEnd w:id="59"/>
     <w:sectPr>
       <w:footnotePr>
         <w:numRestart w:val="eachSect"/>

</xml_diff>

<commit_message>
Widen the greeting label to the page's own width
3 5/8 x 1 1/4 in rather than 1 5/8 — the full width of a service-book page,
which is what the blank space at the foot of page 65 actually is. The greeting
now sets on one line instead of two, the pronunciation on two instead of
three, and all of it at larger type: 8.4pt against 7 for the words, 7.4
against 6.2 for the syllables.

Measured on the rubric's page at 600 dpi: 261.12 x 89.88pt against a target of
261.00 x 90.00, so true size to within a pixel. It is also a standalone Letter
sheet, booklet/label_is_polla.pdf, for printing on its own and cutting out.

Co-Authored-By: Claude Opus 5 <noreply@anthropic.com>
</commit_message>
<xml_diff>
--- a/docs/rubric.docx
+++ b/docs/rubric.docx
@@ -217,7 +217,7 @@
         <w:rPr>
           <w:rStyle w:val="VerbatimChar"/>
         </w:rPr>
-        <w:t xml:space="preserve">generated 27 Aug 2026, 10:01 · 3372930</w:t>
+        <w:t xml:space="preserve">generated 27 Aug 2026, 10:17 · 55103c8</w:t>
       </w:r>
     </w:p>
     <w:p>
@@ -9807,7 +9807,7 @@
         <w:t xml:space="preserve"> </w:t>
       </w:r>
       <w:r>
-        <w:t xml:space="preserve">you rather than in memory. This one is small — a label rather than a page</w:t>
+        <w:t xml:space="preserve">you rather than in memory. This one is a strip rather than a page</w:t>
       </w:r>
       <w:r>
         <w:t xml:space="preserve"> </w:t>
@@ -9831,9 +9831,9 @@
       <w:r>
         <w:drawing>
           <wp:inline>
-            <wp:extent cx="5334000" cy="4103076"/>
+            <wp:extent cx="5334000" cy="1839310"/>
             <wp:effectExtent b="0" l="0" r="0" t="0"/>
-            <wp:docPr descr="The hierarch’s greeting, with its pronunciation" title="card 1.625x1.25" id="66" name="Picture"/>
+            <wp:docPr descr="The hierarch’s greeting, with its pronunciation" title="card 3.625x1.25" id="66" name="Picture"/>
             <a:graphic>
               <a:graphicData uri="http://schemas.openxmlformats.org/drawingml/2006/picture">
                 <pic:pic>
@@ -9852,7 +9852,7 @@
                   <pic:spPr bwMode="auto">
                     <a:xfrm>
                       <a:off x="0" y="0"/>
-                      <a:ext cx="5334000" cy="4103076"/>
+                      <a:ext cx="5334000" cy="1839310"/>
                     </a:xfrm>
                     <a:prstGeom prst="rect">
                       <a:avLst/>

</xml_diff>